<commit_message>
3. He thong thanh toan
</commit_message>
<xml_diff>
--- a/Tuan03/22640121_NguyenTrungQuyen_MinhChung.docx
+++ b/Tuan03/22640121_NguyenTrungQuyen_MinhChung.docx
@@ -51,7 +51,7 @@
           <w:szCs w:val="28"/>
         </w:rPr>
         <w:drawing>
-          <wp:inline distT="0" distB="0" distL="0" distR="0" wp14:anchorId="206A6CAB" wp14:editId="7C2ABD6B">
+          <wp:inline distT="0" distB="0" distL="0" distR="0" wp14:anchorId="0BA266B5" wp14:editId="7A8E32B6">
             <wp:extent cx="5943600" cy="3343275"/>
             <wp:effectExtent l="0" t="0" r="0" b="9525"/>
             <wp:docPr id="1" name="Picture 1"/>
@@ -146,10 +146,10 @@
         </w:rPr>
         <w:lastRenderedPageBreak/>
         <w:drawing>
-          <wp:inline distT="0" distB="0" distL="0" distR="0" wp14:anchorId="069C3717" wp14:editId="1B7A6C48">
+          <wp:inline distT="0" distB="0" distL="0" distR="0" wp14:anchorId="68B0605A" wp14:editId="3CF92559">
             <wp:extent cx="5943600" cy="3343275"/>
             <wp:effectExtent l="0" t="0" r="0" b="9525"/>
-            <wp:docPr id="2" name="Picture 2"/>
+            <wp:docPr id="3" name="Picture 3"/>
             <wp:cNvGraphicFramePr>
               <a:graphicFrameLocks xmlns:a="http://schemas.openxmlformats.org/drawingml/2006/main" noChangeAspect="1"/>
             </wp:cNvGraphicFramePr>
@@ -216,8 +216,76 @@
           <w:szCs w:val="28"/>
         </w:rPr>
       </w:pPr>
+      <w:r>
+        <w:rPr>
+          <w:rFonts w:ascii="Times New Roman" w:hAnsi="Times New Roman" w:cs="Times New Roman"/>
+          <w:sz w:val="28"/>
+          <w:szCs w:val="28"/>
+        </w:rPr>
+        <w:t>Kết quả chạy:</w:t>
+      </w:r>
+    </w:p>
+    <w:p>
+      <w:pPr>
+        <w:rPr>
+          <w:rFonts w:ascii="Times New Roman" w:hAnsi="Times New Roman" w:cs="Times New Roman"/>
+          <w:sz w:val="28"/>
+          <w:szCs w:val="28"/>
+        </w:rPr>
+      </w:pPr>
+      <w:r>
+        <w:rPr>
+          <w:rFonts w:ascii="Times New Roman" w:hAnsi="Times New Roman" w:cs="Times New Roman"/>
+          <w:sz w:val="28"/>
+          <w:szCs w:val="28"/>
+        </w:rPr>
+        <w:drawing>
+          <wp:inline distT="0" distB="0" distL="0" distR="0" wp14:anchorId="1094AC1B" wp14:editId="153F5639">
+            <wp:extent cx="5943600" cy="3343275"/>
+            <wp:effectExtent l="0" t="0" r="0" b="9525"/>
+            <wp:docPr id="4" name="Picture 4"/>
+            <wp:cNvGraphicFramePr>
+              <a:graphicFrameLocks xmlns:a="http://schemas.openxmlformats.org/drawingml/2006/main" noChangeAspect="1"/>
+            </wp:cNvGraphicFramePr>
+            <a:graphic xmlns:a="http://schemas.openxmlformats.org/drawingml/2006/main">
+              <a:graphicData uri="http://schemas.openxmlformats.org/drawingml/2006/picture">
+                <pic:pic xmlns:pic="http://schemas.openxmlformats.org/drawingml/2006/picture">
+                  <pic:nvPicPr>
+                    <pic:cNvPr id="1" name=""/>
+                    <pic:cNvPicPr/>
+                  </pic:nvPicPr>
+                  <pic:blipFill>
+                    <a:blip r:embed="rId6"/>
+                    <a:stretch>
+                      <a:fillRect/>
+                    </a:stretch>
+                  </pic:blipFill>
+                  <pic:spPr>
+                    <a:xfrm>
+                      <a:off x="0" y="0"/>
+                      <a:ext cx="5943600" cy="3343275"/>
+                    </a:xfrm>
+                    <a:prstGeom prst="rect">
+                      <a:avLst/>
+                    </a:prstGeom>
+                  </pic:spPr>
+                </pic:pic>
+              </a:graphicData>
+            </a:graphic>
+          </wp:inline>
+        </w:drawing>
+      </w:r>
       <w:bookmarkStart w:id="0" w:name="_GoBack"/>
       <w:bookmarkEnd w:id="0"/>
+    </w:p>
+    <w:p>
+      <w:pPr>
+        <w:rPr>
+          <w:rFonts w:ascii="Times New Roman" w:hAnsi="Times New Roman" w:cs="Times New Roman"/>
+          <w:sz w:val="28"/>
+          <w:szCs w:val="28"/>
+        </w:rPr>
+      </w:pPr>
     </w:p>
     <w:sectPr>
       <w:pgSz w:w="12240" w:h="15840"/>

</xml_diff>

<commit_message>
ve hinh design pattern
</commit_message>
<xml_diff>
--- a/Tuan03/22640121_NguyenTrungQuyen_MinhChung.docx
+++ b/Tuan03/22640121_NguyenTrungQuyen_MinhChung.docx
@@ -275,8 +275,120 @@
           </wp:inline>
         </w:drawing>
       </w:r>
+    </w:p>
+    <w:p>
+      <w:pPr>
+        <w:rPr>
+          <w:rFonts w:ascii="Times New Roman" w:hAnsi="Times New Roman" w:cs="Times New Roman"/>
+          <w:sz w:val="28"/>
+          <w:szCs w:val="28"/>
+        </w:rPr>
+      </w:pPr>
+    </w:p>
+    <w:p>
+      <w:pPr>
+        <w:rPr>
+          <w:rFonts w:ascii="Times New Roman" w:hAnsi="Times New Roman" w:cs="Times New Roman"/>
+          <w:sz w:val="28"/>
+          <w:szCs w:val="28"/>
+        </w:rPr>
+      </w:pPr>
+      <w:r>
+        <w:rPr>
+          <w:rFonts w:ascii="Times New Roman" w:hAnsi="Times New Roman" w:cs="Times New Roman"/>
+          <w:sz w:val="28"/>
+          <w:szCs w:val="28"/>
+        </w:rPr>
+        <w:lastRenderedPageBreak/>
+        <w:t xml:space="preserve">Vẽ hình </w:t>
+      </w:r>
+      <w:r>
+        <w:rPr>
+          <w:rFonts w:ascii="Times New Roman" w:hAnsi="Times New Roman" w:cs="Times New Roman"/>
+          <w:sz w:val="28"/>
+          <w:szCs w:val="28"/>
+        </w:rPr>
+        <w:t xml:space="preserve">design parttern </w:t>
+      </w:r>
+      <w:proofErr w:type="gramStart"/>
+      <w:r>
+        <w:rPr>
+          <w:rFonts w:ascii="Times New Roman" w:hAnsi="Times New Roman" w:cs="Times New Roman"/>
+          <w:sz w:val="28"/>
+          <w:szCs w:val="28"/>
+        </w:rPr>
+        <w:t>( State</w:t>
+      </w:r>
+      <w:proofErr w:type="gramEnd"/>
+      <w:r>
+        <w:rPr>
+          <w:rFonts w:ascii="Times New Roman" w:hAnsi="Times New Roman" w:cs="Times New Roman"/>
+          <w:sz w:val="28"/>
+          <w:szCs w:val="28"/>
+        </w:rPr>
+        <w:t>, Strategy, Decorator)</w:t>
+      </w:r>
+      <w:r>
+        <w:rPr>
+          <w:rFonts w:ascii="Times New Roman" w:hAnsi="Times New Roman" w:cs="Times New Roman"/>
+          <w:sz w:val="28"/>
+          <w:szCs w:val="28"/>
+        </w:rPr>
+        <w:t xml:space="preserve"> cho bài trên</w:t>
+      </w:r>
       <w:bookmarkStart w:id="0" w:name="_GoBack"/>
       <w:bookmarkEnd w:id="0"/>
+    </w:p>
+    <w:p>
+      <w:pPr>
+        <w:rPr>
+          <w:rFonts w:ascii="Times New Roman" w:hAnsi="Times New Roman" w:cs="Times New Roman"/>
+          <w:sz w:val="28"/>
+          <w:szCs w:val="28"/>
+        </w:rPr>
+      </w:pPr>
+      <w:r>
+        <w:rPr>
+          <w:rFonts w:ascii="Times New Roman" w:hAnsi="Times New Roman" w:cs="Times New Roman"/>
+          <w:sz w:val="28"/>
+          <w:szCs w:val="28"/>
+        </w:rPr>
+        <w:drawing>
+          <wp:inline distT="0" distB="0" distL="0" distR="0" wp14:anchorId="4ED11EAB" wp14:editId="6B5D15FC">
+            <wp:extent cx="5943600" cy="3343275"/>
+            <wp:effectExtent l="0" t="0" r="0" b="9525"/>
+            <wp:docPr id="5" name="Picture 5"/>
+            <wp:cNvGraphicFramePr>
+              <a:graphicFrameLocks xmlns:a="http://schemas.openxmlformats.org/drawingml/2006/main" noChangeAspect="1"/>
+            </wp:cNvGraphicFramePr>
+            <a:graphic xmlns:a="http://schemas.openxmlformats.org/drawingml/2006/main">
+              <a:graphicData uri="http://schemas.openxmlformats.org/drawingml/2006/picture">
+                <pic:pic xmlns:pic="http://schemas.openxmlformats.org/drawingml/2006/picture">
+                  <pic:nvPicPr>
+                    <pic:cNvPr id="1" name=""/>
+                    <pic:cNvPicPr/>
+                  </pic:nvPicPr>
+                  <pic:blipFill>
+                    <a:blip r:embed="rId7"/>
+                    <a:stretch>
+                      <a:fillRect/>
+                    </a:stretch>
+                  </pic:blipFill>
+                  <pic:spPr>
+                    <a:xfrm>
+                      <a:off x="0" y="0"/>
+                      <a:ext cx="5943600" cy="3343275"/>
+                    </a:xfrm>
+                    <a:prstGeom prst="rect">
+                      <a:avLst/>
+                    </a:prstGeom>
+                  </pic:spPr>
+                </pic:pic>
+              </a:graphicData>
+            </a:graphic>
+          </wp:inline>
+        </w:drawing>
+      </w:r>
     </w:p>
     <w:p>
       <w:pPr>

</xml_diff>